<commit_message>
Translate Faculty Council Members List 2025-2026 to Uzbek
Translated all paragraph headings and table content (26 rows) including
council roles, department affiliations, partner organization representatives,
alumni members, and student representatives.

Co-Authored-By: Claude Opus 4.6 <noreply@anthropic.com>
Claude-Session: https://claude.ai/code/session_01N9ZP28hxEfPoWHf2qaE8QM
</commit_message>
<xml_diff>
--- a/Computer Engineering, Software Engineering, Computer systems & their softwares/Annexes/Annex №19 Faculty Council Meeting Protocol/1. Faculty of Information Technologies Council Members List 2025-2026 (EN).docx
+++ b/Computer Engineering, Software Engineering, Computer systems & their softwares/Annexes/Annex №19 Faculty Council Meeting Protocol/1. Faculty of Information Technologies Council Members List 2025-2026 (EN).docx
@@ -19,7 +19,7 @@
           <w:sz w:val="24"/>
           <w:lang w:val="uz-Latn-UZ"/>
         </w:rPr>
-        <w:t>TERMEZ STATE UNIVERSITY</w:t>
+        <w:t xml:space="preserve">TERMIZ DAVLAT UNIVERSITETI </w:t>
       </w:r>
       <w:r>
         <w:rPr>
@@ -28,7 +28,6 @@
           <w:szCs w:val="24"/>
           <w:lang w:val="uz-Latn-UZ" w:eastAsia="uz-Cyrl-UZ"/>
         </w:rPr>
-        <w:t xml:space="preserve"> </w:t>
       </w:r>
     </w:p>
     <w:p>
@@ -48,7 +47,7 @@
           <w:szCs w:val="24"/>
           <w:lang w:val="uz-Latn-UZ" w:eastAsia="uz-Cyrl-UZ"/>
         </w:rPr>
-        <w:t xml:space="preserve"> FACULTY OF INFORMATION TECHNOLOGIES </w:t>
+        <w:t xml:space="preserve"> AXBOROT TEXNOLOGIYALARI FAKULTETI </w:t>
       </w:r>
     </w:p>
     <w:p>
@@ -68,7 +67,7 @@
           <w:sz w:val="24"/>
           <w:lang w:val="uz-Latn-UZ"/>
         </w:rPr>
-        <w:t>LIST OF COUNCIL MEMBERS</w:t>
+        <w:t>KENGASH A'ZOLARI RO'YXATI</w:t>
       </w:r>
     </w:p>
     <w:p>
@@ -88,7 +87,7 @@
           <w:sz w:val="24"/>
           <w:lang w:val="uz-Latn-UZ"/>
         </w:rPr>
-        <w:t>FOR THE 2025–2026 ACADEMIC YEAR</w:t>
+        <w:t>2025–2026 O'QUV YILI UCHUN</w:t>
       </w:r>
     </w:p>
     <w:tbl>
@@ -142,7 +141,7 @@
                 <w:szCs w:val="28"/>
                 <w:lang w:val="uz-Latn-UZ"/>
               </w:rPr>
-              <w:t>Faculty members of the Faculty Council (professors and lecturers)</w:t>
+              <w:t>Fakultet kengashining fakultet a'zolari (professor va o'qituvchilar)</w:t>
             </w:r>
           </w:p>
         </w:tc>
@@ -223,7 +222,7 @@
                 <w:szCs w:val="28"/>
                 <w:lang w:val="uz-Latn-UZ"/>
               </w:rPr>
-              <w:t>Chairperson of the Council, Dean of the Faculty of Information Technologies.</w:t>
+              <w:t>Kengash raisi, Axborot texnologiyalari fakulteti dekani.</w:t>
             </w:r>
           </w:p>
         </w:tc>
@@ -305,16 +304,15 @@
                 <w:szCs w:val="28"/>
                 <w:lang w:val="uz-Latn-UZ"/>
               </w:rPr>
-              <w:t xml:space="preserve">Secretary of the Council, </w:t>
-            </w:r>
-            <w:r>
-              <w:rPr>
-                <w:rFonts w:ascii="Times New Roman" w:hAnsi="Times New Roman"/>
-                <w:sz w:val="28"/>
-                <w:szCs w:val="28"/>
-                <w:lang w:val="uz-Latn-UZ"/>
-              </w:rPr>
-              <w:t>Senior Lecturer, Department of Mathematical Modeling and Computer Sciences.</w:t>
+              <w:t>Kengash kotibi, Matematik modellashtirish va kompyuter fanlari kafedrasi katta o'qituvchisi.</w:t>
+            </w:r>
+            <w:r>
+              <w:rPr>
+                <w:rFonts w:ascii="Times New Roman" w:hAnsi="Times New Roman"/>
+                <w:sz w:val="28"/>
+                <w:szCs w:val="28"/>
+                <w:lang w:val="uz-Latn-UZ"/>
+              </w:rPr>
             </w:r>
           </w:p>
         </w:tc>
@@ -394,7 +392,7 @@
                 <w:szCs w:val="28"/>
                 <w:lang w:val="uz-Latn-UZ"/>
               </w:rPr>
-              <w:t>Member, Deputy Dean for Youth Affairs and Spiritual-Educational Work.</w:t>
+              <w:t>A'zo, Yoshlar ishlari va ma'naviy-ma'rifiy ish bo'yicha dekan o'rinbosari.</w:t>
             </w:r>
           </w:p>
         </w:tc>
@@ -475,7 +473,7 @@
                 <w:szCs w:val="28"/>
                 <w:lang w:val="uz-Latn-UZ"/>
               </w:rPr>
-              <w:t xml:space="preserve">Member, </w:t>
+              <w:t>A'zo, Ro'yxatga olish bo'limi xodimi</w:t>
             </w:r>
             <w:r>
               <w:rPr>
@@ -484,7 +482,6 @@
                 <w:szCs w:val="28"/>
                 <w:lang w:val="en-US"/>
               </w:rPr>
-              <w:t>Registrar's Office Staff Member</w:t>
             </w:r>
           </w:p>
         </w:tc>
@@ -565,7 +562,7 @@
                 <w:szCs w:val="28"/>
                 <w:lang w:val="uz-Latn-UZ"/>
               </w:rPr>
-              <w:t>Member, Chairperson of the Faculty Women's Committee.</w:t>
+              <w:t>A'zo, Fakultet xotin-qizlar qo'mitasi raisi.</w:t>
             </w:r>
           </w:p>
         </w:tc>
@@ -644,7 +641,7 @@
                 <w:szCs w:val="28"/>
                 <w:lang w:val="uz-Latn-UZ"/>
               </w:rPr>
-              <w:t>Member, Head of the Department of Applied Mathematics.</w:t>
+              <w:t>A'zo, Amaliy matematika kafedrasi mudiri.</w:t>
             </w:r>
           </w:p>
         </w:tc>
@@ -723,7 +720,7 @@
                 <w:szCs w:val="28"/>
                 <w:lang w:val="uz-Latn-UZ"/>
               </w:rPr>
-              <w:t>Member, Head of the Department of Mathematical Modeling and Computer Sciences.</w:t>
+              <w:t>A'zo, Matematik modellashtirish va kompyuter fanlari kafedrasi mudiri.</w:t>
             </w:r>
           </w:p>
         </w:tc>
@@ -804,7 +801,7 @@
                 <w:szCs w:val="28"/>
                 <w:lang w:val="uz-Latn-UZ"/>
               </w:rPr>
-              <w:t>Member, Head of the Department of Computer and Software Engineering</w:t>
+              <w:t>A'zo, Kompyuter va dasturiy ta'minot muhandisligi kafedrasi mudiri</w:t>
             </w:r>
           </w:p>
         </w:tc>
@@ -883,7 +880,7 @@
                 <w:szCs w:val="28"/>
                 <w:lang w:val="uz-Latn-UZ"/>
               </w:rPr>
-              <w:t>Member, Chairperson of the Council of Elders. Professor, Department of Applied Mathematics</w:t>
+              <w:t>A'zo, Oqsoqollar kengashi raisi. Amaliy matematika kafedrasi professori</w:t>
             </w:r>
           </w:p>
         </w:tc>
@@ -963,7 +960,7 @@
                 <w:szCs w:val="28"/>
                 <w:lang w:val="uz-Latn-UZ"/>
               </w:rPr>
-              <w:t>Member, Professor, Department of Computer and Software Engineering.</w:t>
+              <w:t>A'zo, Kompyuter va dasturiy ta'minot muhandisligi kafedrasi professori.</w:t>
             </w:r>
           </w:p>
         </w:tc>
@@ -1041,7 +1038,7 @@
                 <w:szCs w:val="28"/>
                 <w:lang w:val="uz-Latn-UZ"/>
               </w:rPr>
-              <w:t>Member, Chairperson of the Trade Union Council.</w:t>
+              <w:t>A'zo, Kasaba uyushmasi kengashi raisi.</w:t>
             </w:r>
           </w:p>
         </w:tc>
@@ -1077,7 +1074,7 @@
                 <w:szCs w:val="28"/>
                 <w:lang w:val="uz-Latn-UZ"/>
               </w:rPr>
-              <w:t>Representatives of partner organizations — Council members</w:t>
+              <w:t>Hamkor tashkilotlar vakillari — Kengash a'zolari</w:t>
             </w:r>
           </w:p>
         </w:tc>
@@ -1158,26 +1155,24 @@
                 <w:szCs w:val="28"/>
                 <w:lang w:val="uz-Latn-UZ"/>
               </w:rPr>
-              <w:t xml:space="preserve">Member, Leader of the Primary Organization of the Youth Union of Uzbekistan at the </w:t>
-            </w:r>
-            <w:r>
-              <w:rPr>
-                <w:rFonts w:ascii="Times New Roman" w:hAnsi="Times New Roman"/>
-                <w:bCs/>
-                <w:sz w:val="28"/>
-                <w:szCs w:val="28"/>
-                <w:lang w:val="uz-Latn-UZ"/>
-              </w:rPr>
-              <w:t>Faculty of Information Technologies,</w:t>
-            </w:r>
-            <w:r>
-              <w:rPr>
-                <w:rFonts w:ascii="Times New Roman" w:hAnsi="Times New Roman"/>
-                <w:sz w:val="28"/>
-                <w:szCs w:val="28"/>
-                <w:lang w:val="uz-Latn-UZ"/>
-              </w:rPr>
-              <w:t xml:space="preserve"> Termez State University</w:t>
+              <w:t>A'zo, Termiz davlat universiteti Axborot texnologiyalari fakulteti O'zbekiston Yoshlar ittifoqi boshlang'ich tashkiloti yetakchisi</w:t>
+            </w:r>
+            <w:r>
+              <w:rPr>
+                <w:rFonts w:ascii="Times New Roman" w:hAnsi="Times New Roman"/>
+                <w:bCs/>
+                <w:sz w:val="28"/>
+                <w:szCs w:val="28"/>
+                <w:lang w:val="uz-Latn-UZ"/>
+              </w:rPr>
+            </w:r>
+            <w:r>
+              <w:rPr>
+                <w:rFonts w:ascii="Times New Roman" w:hAnsi="Times New Roman"/>
+                <w:sz w:val="28"/>
+                <w:szCs w:val="28"/>
+                <w:lang w:val="uz-Latn-UZ"/>
+              </w:rPr>
             </w:r>
           </w:p>
         </w:tc>
@@ -1256,7 +1251,7 @@
                 <w:szCs w:val="28"/>
                 <w:lang w:val="uz-Latn-UZ"/>
               </w:rPr>
-              <w:t>Member, Chief Specialist, Surkhandarya Regional Branch of the Ministry of Digital Technologies (graduate and employer representative)</w:t>
+              <w:t>A'zo, Raqamli texnologiyalar vazirligi Surxondaryo viloyati filiali bosh mutaxassisi (bitiruvchi va ish beruvchi vakili)</w:t>
             </w:r>
           </w:p>
         </w:tc>
@@ -1336,7 +1331,7 @@
                 <w:szCs w:val="28"/>
                 <w:lang w:val="uz-Latn-UZ"/>
               </w:rPr>
-              <w:t>Member, Representative of "Surkhonsanoatqurilish" Company</w:t>
+              <w:t>A'zo, "Surxonsanoatqurilish" kompaniyasi vakili</w:t>
             </w:r>
           </w:p>
         </w:tc>
@@ -1417,7 +1412,7 @@
                 <w:szCs w:val="28"/>
                 <w:lang w:val="uz-Latn-UZ"/>
               </w:rPr>
-              <w:t>Member, Muzrabot Vocational College of Services, Muzrabot District (employer representative)</w:t>
+              <w:t>A'zo, Muzrobot tumani Muzrobot xizmat ko'rsatish kasb-hunar kolleji (ish beruvchi vakili)</w:t>
             </w:r>
           </w:p>
         </w:tc>
@@ -1498,7 +1493,7 @@
                 <w:szCs w:val="28"/>
                 <w:lang w:val="uz-Latn-UZ"/>
               </w:rPr>
-              <w:t>Member, Director, Angor Digital Technologies Vocational College (graduate and employer representative)</w:t>
+              <w:t>A'zo, Angor raqamli texnologiyalar kasb-hunar kolleji direktori (bitiruvchi va ish beruvchi vakili)</w:t>
             </w:r>
           </w:p>
         </w:tc>
@@ -1534,7 +1529,7 @@
                 <w:szCs w:val="28"/>
                 <w:lang w:val="uz-Latn-UZ"/>
               </w:rPr>
-              <w:t>Former graduates — Council members</w:t>
+              <w:t>Sobiq bitiruvchilar — Kengash a'zolari</w:t>
             </w:r>
           </w:p>
         </w:tc>
@@ -1616,7 +1611,7 @@
                 <w:szCs w:val="28"/>
                 <w:lang w:val="uz-Latn-UZ"/>
               </w:rPr>
-              <w:t xml:space="preserve">Member, </w:t>
+              <w:t>A'zo, Termizdagi Prezident maktabi o'qituvchisi (bitiruvchi)</w:t>
             </w:r>
             <w:r>
               <w:rPr>
@@ -1625,7 +1620,6 @@
                 <w:szCs w:val="28"/>
                 <w:lang w:val="en-US"/>
               </w:rPr>
-              <w:t>Teacher, Presidential School in Termez (graduate)</w:t>
             </w:r>
           </w:p>
         </w:tc>
@@ -1707,7 +1701,7 @@
                 <w:szCs w:val="28"/>
                 <w:lang w:val="uz-Latn-UZ"/>
               </w:rPr>
-              <w:t>Member, Senior Artificial Intelligence Engineer, Seoreu Co., Ltd., Busan, Republic of Korea (graduate)</w:t>
+              <w:t>A'zo, Seoreu Co., Ltd., Busan, Koreya Respublikasi, katta sun'iy intellekt muhandisi (bitiruvchi)</w:t>
             </w:r>
           </w:p>
         </w:tc>
@@ -1789,7 +1783,7 @@
                 <w:szCs w:val="28"/>
                 <w:lang w:val="uz-Latn-UZ"/>
               </w:rPr>
-              <w:t>Member, Deputy Director for Academic Affairs, School No. 30, Termez District; Deputy, People's Deputies of Termez District (graduate and employer representative)</w:t>
+              <w:t>A'zo, Termiz tumani 30-son maktab o'quv ishlari bo'yicha direktor o'rinbosari; Termiz tumani Xalq deputatlari kengashi deputati (bitiruvchi va ish beruvchi vakili)</w:t>
             </w:r>
           </w:p>
         </w:tc>
@@ -1825,7 +1819,7 @@
                 <w:szCs w:val="28"/>
                 <w:lang w:val="uz-Latn-UZ"/>
               </w:rPr>
-              <w:t>Students — Council members</w:t>
+              <w:t>Talabalar — Kengash a'zolari</w:t>
             </w:r>
           </w:p>
         </w:tc>
@@ -1910,7 +1904,7 @@
                 <w:szCs w:val="28"/>
                 <w:lang w:val="uz-Latn-UZ"/>
               </w:rPr>
-              <w:t>3rd-year student, Applied Mathematics program</w:t>
+              <w:t>3-kurs talabasi, Amaliy matematika yo'nalishi</w:t>
             </w:r>
           </w:p>
         </w:tc>
@@ -1993,7 +1987,7 @@
                 <w:szCs w:val="28"/>
                 <w:lang w:val="uz-Latn-UZ"/>
               </w:rPr>
-              <w:t>3rd-year student, Computer Engineering program</w:t>
+              <w:t>3-kurs talabasi, Kompyuter muhandisligi yo'nalishi</w:t>
             </w:r>
           </w:p>
         </w:tc>
@@ -2076,7 +2070,7 @@
                 <w:szCs w:val="28"/>
                 <w:lang w:val="uz-Latn-UZ"/>
               </w:rPr>
-              <w:t>3rd-year student, Software Engineering program</w:t>
+              <w:t>3-kurs talabasi, Dasturiy ta'minot muhandisligi yo'nalishi</w:t>
             </w:r>
           </w:p>
         </w:tc>
@@ -2115,7 +2109,12 @@
           <w:szCs w:val="28"/>
           <w:lang w:val="uz-Latn-UZ"/>
         </w:rPr>
-        <w:t>Secretary of the Council:</w:t>
+        <w:t>Kengash kotibi:</w:t>
+        <w:tab/>
+        <w:tab/>
+        <w:tab/>
+        <w:tab/>
+        <w:t>Abdullayev B.P.</w:t>
       </w:r>
       <w:r>
         <w:rPr>
@@ -2125,7 +2124,6 @@
           <w:szCs w:val="28"/>
           <w:lang w:val="uz-Latn-UZ"/>
         </w:rPr>
-        <w:tab/>
       </w:r>
       <w:r>
         <w:rPr>
@@ -2135,7 +2133,6 @@
           <w:szCs w:val="28"/>
           <w:lang w:val="uz-Latn-UZ"/>
         </w:rPr>
-        <w:tab/>
       </w:r>
       <w:r>
         <w:rPr>
@@ -2145,7 +2142,6 @@
           <w:szCs w:val="28"/>
           <w:lang w:val="uz-Latn-UZ"/>
         </w:rPr>
-        <w:tab/>
       </w:r>
       <w:r>
         <w:rPr>
@@ -2155,8 +2151,6 @@
           <w:szCs w:val="28"/>
           <w:lang w:val="uz-Latn-UZ"/>
         </w:rPr>
-        <w:tab/>
-        <w:t>Abdullayev B.P.</w:t>
       </w:r>
     </w:p>
     <w:p>
@@ -2175,7 +2169,15 @@
           <w:szCs w:val="28"/>
           <w:lang w:val="uz-Latn-UZ"/>
         </w:rPr>
-        <w:t>Chairperson of the Council:</w:t>
+        <w:t>Kengash raisi:</w:t>
+        <w:tab/>
+        <w:tab/>
+        <w:tab/>
+        <w:tab/>
+        <w:t xml:space="preserve"> </w:t>
+        <w:tab/>
+        <w:tab/>
+        <w:t>Djumayev F.T.</w:t>
       </w:r>
       <w:r>
         <w:rPr>
@@ -2185,7 +2187,6 @@
           <w:szCs w:val="28"/>
           <w:lang w:val="uz-Latn-UZ"/>
         </w:rPr>
-        <w:tab/>
       </w:r>
       <w:r>
         <w:rPr>
@@ -2195,8 +2196,6 @@
           <w:szCs w:val="28"/>
           <w:lang w:val="uz-Latn-UZ"/>
         </w:rPr>
-        <w:tab/>
-        <w:t xml:space="preserve"> </w:t>
       </w:r>
       <w:r>
         <w:rPr>
@@ -2206,7 +2205,6 @@
           <w:szCs w:val="28"/>
           <w:lang w:val="uz-Latn-UZ"/>
         </w:rPr>
-        <w:tab/>
       </w:r>
       <w:r>
         <w:rPr>
@@ -2216,8 +2214,6 @@
           <w:szCs w:val="28"/>
           <w:lang w:val="uz-Latn-UZ"/>
         </w:rPr>
-        <w:tab/>
-        <w:t>Djumayev F.T.</w:t>
       </w:r>
     </w:p>
     <w:sectPr>

</xml_diff>